<commit_message>
Reordered my sections. Updated a tiny bit my word document. Expanded upon my work experience. Updated my list of skills. Refactored the TagList into its own component.
</commit_message>
<xml_diff>
--- a/public/files/Test_Plan_V1.docx
+++ b/public/files/Test_Plan_V1.docx
@@ -77,7 +77,31 @@
           <w:szCs w:val="26"/>
           <w:lang w:val="en-US"/>
         </w:rPr>
-        <w:t>Joint Action on Personalised Cancer Medicine</w:t>
+        <w:t xml:space="preserve">Joint Action on </w:t>
+      </w:r>
+      <w:proofErr w:type="spellStart"/>
+      <w:r>
+        <w:rPr>
+          <w:i/>
+          <w:iCs/>
+          <w:color w:val="666666"/>
+          <w:sz w:val="26"/>
+          <w:szCs w:val="26"/>
+          <w:lang w:val="en-US"/>
+        </w:rPr>
+        <w:t>Personalised</w:t>
+      </w:r>
+      <w:proofErr w:type="spellEnd"/>
+      <w:r>
+        <w:rPr>
+          <w:i/>
+          <w:iCs/>
+          <w:color w:val="666666"/>
+          <w:sz w:val="26"/>
+          <w:szCs w:val="26"/>
+          <w:lang w:val="en-US"/>
+        </w:rPr>
+        <w:t xml:space="preserve"> Cancer Medicine</w:t>
       </w:r>
     </w:p>
     <w:p>
@@ -158,8 +182,13 @@
           </w:tcPr>
           <w:p>
             <w:r>
-              <w:t>JAPCM Website</w:t>
-            </w:r>
+              <w:t xml:space="preserve">JAPCM </w:t>
+            </w:r>
+            <w:proofErr w:type="spellStart"/>
+            <w:r>
+              <w:t>Website</w:t>
+            </w:r>
+            <w:proofErr w:type="spellEnd"/>
           </w:p>
         </w:tc>
       </w:tr>
@@ -203,9 +232,11 @@
             </w:tcMar>
           </w:tcPr>
           <w:p>
-            <w:r>
-              <w:t>Sciensano (Belgium)</w:t>
-            </w:r>
+            <w:proofErr w:type="spellStart"/>
+            <w:r>
+              <w:t>Sciensano</w:t>
+            </w:r>
+            <w:proofErr w:type="spellEnd"/>
           </w:p>
         </w:tc>
       </w:tr>
@@ -421,14 +452,34 @@
       <w:pPr>
         <w:jc w:val="center"/>
       </w:pPr>
+      <w:proofErr w:type="spellStart"/>
       <w:r>
         <w:rPr>
           <w:color w:val="999999"/>
           <w:sz w:val="20"/>
           <w:szCs w:val="20"/>
         </w:rPr>
-        <w:t>Sciensano — ICT Development</w:t>
-      </w:r>
+        <w:t>Sciensano</w:t>
+      </w:r>
+      <w:proofErr w:type="spellEnd"/>
+      <w:r>
+        <w:rPr>
+          <w:color w:val="999999"/>
+          <w:sz w:val="20"/>
+          <w:szCs w:val="20"/>
+        </w:rPr>
+        <w:t xml:space="preserve"> — ICT </w:t>
+      </w:r>
+      <w:proofErr w:type="spellStart"/>
+      <w:r>
+        <w:rPr>
+          <w:color w:val="999999"/>
+          <w:sz w:val="20"/>
+          <w:szCs w:val="20"/>
+        </w:rPr>
+        <w:t>Development</w:t>
+      </w:r>
+      <w:proofErr w:type="spellEnd"/>
     </w:p>
     <w:p>
       <w:r>
@@ -2567,7 +2618,49 @@
         <w:rPr>
           <w:lang w:val="en-US"/>
         </w:rPr>
-        <w:t>This document describes the test plan for the JAPCM website, a Drupal 10 site built and hosted by Sciensano as part of the Joint Action on Personalised Cancer Medicine — a four-year European health initiative funded under the EU4Health programme.</w:t>
+        <w:t xml:space="preserve">This document describes the test plan for the JAPCM website, a Drupal 10 site built and hosted by </w:t>
+      </w:r>
+      <w:proofErr w:type="spellStart"/>
+      <w:r>
+        <w:rPr>
+          <w:lang w:val="en-US"/>
+        </w:rPr>
+        <w:t>Sciensano</w:t>
+      </w:r>
+      <w:proofErr w:type="spellEnd"/>
+      <w:r>
+        <w:rPr>
+          <w:lang w:val="en-US"/>
+        </w:rPr>
+        <w:t xml:space="preserve"> as part of the Joint Action on </w:t>
+      </w:r>
+      <w:proofErr w:type="spellStart"/>
+      <w:r>
+        <w:rPr>
+          <w:lang w:val="en-US"/>
+        </w:rPr>
+        <w:t>Personalised</w:t>
+      </w:r>
+      <w:proofErr w:type="spellEnd"/>
+      <w:r>
+        <w:rPr>
+          <w:lang w:val="en-US"/>
+        </w:rPr>
+        <w:t xml:space="preserve"> Cancer Medicine — a four-year European health initiative funded under the EU4Health </w:t>
+      </w:r>
+      <w:proofErr w:type="spellStart"/>
+      <w:r>
+        <w:rPr>
+          <w:lang w:val="en-US"/>
+        </w:rPr>
+        <w:t>programme</w:t>
+      </w:r>
+      <w:proofErr w:type="spellEnd"/>
+      <w:r>
+        <w:rPr>
+          <w:lang w:val="en-US"/>
+        </w:rPr>
+        <w:t>.</w:t>
       </w:r>
     </w:p>
     <w:p>
@@ -2589,7 +2682,21 @@
         <w:rPr>
           <w:lang w:val="en-US"/>
         </w:rPr>
-        <w:t>The site is a public-facing communication platform. It lets Content Editors manage and publish items such as news, events, deliverables, workpackages, pilots, and partner information. Anonymous visitors can browse all of this content without logging in.</w:t>
+        <w:t xml:space="preserve">The site is a public-facing communication platform. It lets Content Editors manage and publish items such as news, events, deliverables, </w:t>
+      </w:r>
+      <w:proofErr w:type="spellStart"/>
+      <w:r>
+        <w:rPr>
+          <w:lang w:val="en-US"/>
+        </w:rPr>
+        <w:t>workpackages</w:t>
+      </w:r>
+      <w:proofErr w:type="spellEnd"/>
+      <w:r>
+        <w:rPr>
+          <w:lang w:val="en-US"/>
+        </w:rPr>
+        <w:t>, pilots, and partner information. Anonymous visitors can browse all of this content without logging in.</w:t>
       </w:r>
     </w:p>
     <w:p>
@@ -2668,7 +2775,15 @@
         <w:t xml:space="preserve">The main goal of testing is to confirm that the website works as described in the functional analysis. </w:t>
       </w:r>
       <w:r>
-        <w:t>More specifically:</w:t>
+        <w:t xml:space="preserve">More </w:t>
+      </w:r>
+      <w:proofErr w:type="spellStart"/>
+      <w:r>
+        <w:t>specifically</w:t>
+      </w:r>
+      <w:proofErr w:type="spellEnd"/>
+      <w:r>
+        <w:t xml:space="preserve"> :</w:t>
       </w:r>
     </w:p>
     <w:p>
@@ -2799,9 +2914,14 @@
       </w:pPr>
       <w:bookmarkStart w:id="3" w:name="_Toc231855876"/>
       <w:r>
-        <w:t>2.2 Tasks</w:t>
+        <w:t xml:space="preserve">2.2 </w:t>
+      </w:r>
+      <w:proofErr w:type="spellStart"/>
+      <w:r>
+        <w:t>Tasks</w:t>
       </w:r>
       <w:bookmarkEnd w:id="3"/>
+      <w:proofErr w:type="spellEnd"/>
     </w:p>
     <w:p>
       <w:pPr>
@@ -3009,6 +3129,7 @@
         <w:rPr>
           <w:lang w:val="en-US"/>
         </w:rPr>
+        <w:lastRenderedPageBreak/>
         <w:t>Testing covers all use cases from functional analysis V0.5, including:</w:t>
       </w:r>
     </w:p>
@@ -3066,7 +3187,21 @@
         <w:rPr>
           <w:lang w:val="en-US"/>
         </w:rPr>
-        <w:t>Third-party integrations: newsletter subscription, contact form emails, cookie consent, analytics, and the Sciensano SharePoint link.</w:t>
+        <w:t xml:space="preserve">Third-party integrations: newsletter subscription, contact form emails, cookie consent, analytics, and the </w:t>
+      </w:r>
+      <w:proofErr w:type="spellStart"/>
+      <w:r>
+        <w:rPr>
+          <w:lang w:val="en-US"/>
+        </w:rPr>
+        <w:t>Sciensano</w:t>
+      </w:r>
+      <w:proofErr w:type="spellEnd"/>
+      <w:r>
+        <w:rPr>
+          <w:lang w:val="en-US"/>
+        </w:rPr>
+        <w:t xml:space="preserve"> SharePoint link.</w:t>
       </w:r>
     </w:p>
     <w:p>
@@ -3102,9 +3237,38 @@
       </w:pPr>
       <w:bookmarkStart w:id="6" w:name="_Toc231855879"/>
       <w:r>
-        <w:t>3.2 What is not being tested</w:t>
+        <w:t xml:space="preserve">3.2 </w:t>
+      </w:r>
+      <w:proofErr w:type="spellStart"/>
+      <w:r>
+        <w:t>What</w:t>
+      </w:r>
+      <w:proofErr w:type="spellEnd"/>
+      <w:r>
+        <w:t xml:space="preserve"> </w:t>
+      </w:r>
+      <w:proofErr w:type="spellStart"/>
+      <w:r>
+        <w:t>is</w:t>
+      </w:r>
+      <w:proofErr w:type="spellEnd"/>
+      <w:r>
+        <w:t xml:space="preserve"> not </w:t>
+      </w:r>
+      <w:proofErr w:type="spellStart"/>
+      <w:r>
+        <w:t>being</w:t>
+      </w:r>
+      <w:proofErr w:type="spellEnd"/>
+      <w:r>
+        <w:t xml:space="preserve"> </w:t>
+      </w:r>
+      <w:proofErr w:type="spellStart"/>
+      <w:r>
+        <w:t>tested</w:t>
       </w:r>
       <w:bookmarkEnd w:id="6"/>
+      <w:proofErr w:type="spellEnd"/>
     </w:p>
     <w:p>
       <w:pPr>
@@ -3135,7 +3299,23 @@
         <w:spacing w:before="40" w:after="40"/>
       </w:pPr>
       <w:r>
-        <w:t>Performance or load testing.</w:t>
+        <w:t xml:space="preserve">Performance or </w:t>
+      </w:r>
+      <w:proofErr w:type="spellStart"/>
+      <w:r>
+        <w:t>load</w:t>
+      </w:r>
+      <w:proofErr w:type="spellEnd"/>
+      <w:r>
+        <w:t xml:space="preserve"> </w:t>
+      </w:r>
+      <w:proofErr w:type="spellStart"/>
+      <w:r>
+        <w:t>testing</w:t>
+      </w:r>
+      <w:proofErr w:type="spellEnd"/>
+      <w:r>
+        <w:t>.</w:t>
       </w:r>
     </w:p>
     <w:p>
@@ -3148,7 +3328,15 @@
         <w:spacing w:before="40" w:after="40"/>
       </w:pPr>
       <w:r>
-        <w:t>Security testing.</w:t>
+        <w:t xml:space="preserve">Security </w:t>
+      </w:r>
+      <w:proofErr w:type="spellStart"/>
+      <w:r>
+        <w:t>testing</w:t>
+      </w:r>
+      <w:proofErr w:type="spellEnd"/>
+      <w:r>
+        <w:t>.</w:t>
       </w:r>
     </w:p>
     <w:p>
@@ -3180,7 +3368,15 @@
         <w:spacing w:before="40" w:after="40"/>
       </w:pPr>
       <w:r>
-        <w:t>Server configuration or hosting infrastructure.</w:t>
+        <w:t xml:space="preserve">Server configuration or </w:t>
+      </w:r>
+      <w:proofErr w:type="spellStart"/>
+      <w:r>
+        <w:t>hosting</w:t>
+      </w:r>
+      <w:proofErr w:type="spellEnd"/>
+      <w:r>
+        <w:t xml:space="preserve"> infrastructure.</w:t>
       </w:r>
     </w:p>
     <w:p>
@@ -3199,7 +3395,21 @@
         <w:rPr>
           <w:lang w:val="en-US"/>
         </w:rPr>
-        <w:t>The Sciensano IDP authentication server itself, which is an external system.</w:t>
+        <w:t xml:space="preserve">The </w:t>
+      </w:r>
+      <w:proofErr w:type="spellStart"/>
+      <w:r>
+        <w:rPr>
+          <w:lang w:val="en-US"/>
+        </w:rPr>
+        <w:t>Sciensano</w:t>
+      </w:r>
+      <w:proofErr w:type="spellEnd"/>
+      <w:r>
+        <w:rPr>
+          <w:lang w:val="en-US"/>
+        </w:rPr>
+        <w:t xml:space="preserve"> IDP authentication server itself, which is an external system.</w:t>
       </w:r>
     </w:p>
     <w:p>
@@ -3376,7 +3586,15 @@
         <w:t xml:space="preserve">Once feature testing passes, integration testing checks that the different parts of the system work together correctly. </w:t>
       </w:r>
       <w:r>
-        <w:t>This includes:</w:t>
+        <w:t xml:space="preserve">This </w:t>
+      </w:r>
+      <w:proofErr w:type="spellStart"/>
+      <w:r>
+        <w:t>includes</w:t>
+      </w:r>
+      <w:proofErr w:type="spellEnd"/>
+      <w:r>
+        <w:t>:</w:t>
       </w:r>
     </w:p>
     <w:p>
@@ -3414,7 +3632,36 @@
         <w:rPr>
           <w:lang w:val="en-US"/>
         </w:rPr>
-        <w:t>The newsletter button takes the user to the correct Spotler/Mailpro page.</w:t>
+        <w:lastRenderedPageBreak/>
+        <w:t xml:space="preserve">The newsletter button takes the user to the correct </w:t>
+      </w:r>
+      <w:proofErr w:type="spellStart"/>
+      <w:r>
+        <w:rPr>
+          <w:lang w:val="en-US"/>
+        </w:rPr>
+        <w:t>Spotler</w:t>
+      </w:r>
+      <w:proofErr w:type="spellEnd"/>
+      <w:r>
+        <w:rPr>
+          <w:lang w:val="en-US"/>
+        </w:rPr>
+        <w:t>/</w:t>
+      </w:r>
+      <w:proofErr w:type="spellStart"/>
+      <w:r>
+        <w:rPr>
+          <w:lang w:val="en-US"/>
+        </w:rPr>
+        <w:t>Mailpro</w:t>
+      </w:r>
+      <w:proofErr w:type="spellEnd"/>
+      <w:r>
+        <w:rPr>
+          <w:lang w:val="en-US"/>
+        </w:rPr>
+        <w:t xml:space="preserve"> page.</w:t>
       </w:r>
     </w:p>
     <w:p>
@@ -3452,7 +3699,21 @@
         <w:rPr>
           <w:lang w:val="en-US"/>
         </w:rPr>
-        <w:t>The UserCentrics cookie banner appears on first visit and blocks Google Analytics until the user gives consent.</w:t>
+        <w:t xml:space="preserve">The </w:t>
+      </w:r>
+      <w:proofErr w:type="spellStart"/>
+      <w:r>
+        <w:rPr>
+          <w:lang w:val="en-US"/>
+        </w:rPr>
+        <w:t>UserCentrics</w:t>
+      </w:r>
+      <w:proofErr w:type="spellEnd"/>
+      <w:r>
+        <w:rPr>
+          <w:lang w:val="en-US"/>
+        </w:rPr>
+        <w:t xml:space="preserve"> cookie banner appears on first visit and blocks Google Analytics until the user gives consent.</w:t>
       </w:r>
     </w:p>
     <w:p>
@@ -3471,7 +3732,21 @@
         <w:rPr>
           <w:lang w:val="en-US"/>
         </w:rPr>
-        <w:t>The Workspace button only appears for authenticated Sciensano IDP users and points to the right SharePoint URL.</w:t>
+        <w:t xml:space="preserve">The Workspace button only appears for authenticated </w:t>
+      </w:r>
+      <w:proofErr w:type="spellStart"/>
+      <w:r>
+        <w:rPr>
+          <w:lang w:val="en-US"/>
+        </w:rPr>
+        <w:t>Sciensano</w:t>
+      </w:r>
+      <w:proofErr w:type="spellEnd"/>
+      <w:r>
+        <w:rPr>
+          <w:lang w:val="en-US"/>
+        </w:rPr>
+        <w:t xml:space="preserve"> IDP users and points to the right SharePoint URL.</w:t>
       </w:r>
     </w:p>
     <w:p>
@@ -3773,9 +4048,11 @@
             </w:tcMar>
           </w:tcPr>
           <w:p>
+            <w:proofErr w:type="spellStart"/>
             <w:r>
               <w:t>Environment</w:t>
             </w:r>
+            <w:proofErr w:type="spellEnd"/>
           </w:p>
         </w:tc>
         <w:tc>
@@ -3795,8 +4072,21 @@
             </w:tcMar>
           </w:tcPr>
           <w:p>
-            <w:r>
-              <w:t>Dedicated internal test server</w:t>
+            <w:proofErr w:type="spellStart"/>
+            <w:r>
+              <w:t>Dedicated</w:t>
+            </w:r>
+            <w:proofErr w:type="spellEnd"/>
+            <w:r>
+              <w:t xml:space="preserve"> </w:t>
+            </w:r>
+            <w:proofErr w:type="spellStart"/>
+            <w:r>
+              <w:t>internal</w:t>
+            </w:r>
+            <w:proofErr w:type="spellEnd"/>
+            <w:r>
+              <w:t xml:space="preserve"> test server</w:t>
             </w:r>
           </w:p>
         </w:tc>
@@ -3842,7 +4132,15 @@
           </w:tcPr>
           <w:p>
             <w:r>
-              <w:t>[Test server URL — internal]</w:t>
+              <w:t xml:space="preserve">[Test server URL — </w:t>
+            </w:r>
+            <w:proofErr w:type="spellStart"/>
+            <w:r>
+              <w:t>internal</w:t>
+            </w:r>
+            <w:proofErr w:type="spellEnd"/>
+            <w:r>
+              <w:t>]</w:t>
             </w:r>
           </w:p>
         </w:tc>
@@ -3911,9 +4209,11 @@
             </w:tcMar>
           </w:tcPr>
           <w:p>
+            <w:proofErr w:type="spellStart"/>
             <w:r>
               <w:t>Database</w:t>
             </w:r>
+            <w:proofErr w:type="spellEnd"/>
           </w:p>
         </w:tc>
         <w:tc>
@@ -4020,8 +4320,13 @@
           </w:tcPr>
           <w:p>
             <w:r>
-              <w:t>UAT environment</w:t>
-            </w:r>
+              <w:t xml:space="preserve">UAT </w:t>
+            </w:r>
+            <w:proofErr w:type="spellStart"/>
+            <w:r>
+              <w:t>environment</w:t>
+            </w:r>
+            <w:proofErr w:type="spellEnd"/>
           </w:p>
         </w:tc>
         <w:tc>
@@ -4088,10 +4393,43 @@
         <w:rPr>
           <w:lang w:val="en-US"/>
         </w:rPr>
+        <w:lastRenderedPageBreak/>
         <w:t xml:space="preserve">All browser testing is done on desktop. Responsive layout is checked using Chrome DevTools device emulation. </w:t>
       </w:r>
       <w:r>
-        <w:t>No physical mobile or tablet devices are used.</w:t>
+        <w:t xml:space="preserve">No </w:t>
+      </w:r>
+      <w:proofErr w:type="spellStart"/>
+      <w:r>
+        <w:t>physical</w:t>
+      </w:r>
+      <w:proofErr w:type="spellEnd"/>
+      <w:r>
+        <w:t xml:space="preserve"> mobile or </w:t>
+      </w:r>
+      <w:proofErr w:type="spellStart"/>
+      <w:r>
+        <w:t>tablet</w:t>
+      </w:r>
+      <w:proofErr w:type="spellEnd"/>
+      <w:r>
+        <w:t xml:space="preserve"> </w:t>
+      </w:r>
+      <w:proofErr w:type="spellStart"/>
+      <w:r>
+        <w:t>devices</w:t>
+      </w:r>
+      <w:proofErr w:type="spellEnd"/>
+      <w:r>
+        <w:t xml:space="preserve"> are </w:t>
+      </w:r>
+      <w:proofErr w:type="spellStart"/>
+      <w:r>
+        <w:t>used</w:t>
+      </w:r>
+      <w:proofErr w:type="spellEnd"/>
+      <w:r>
+        <w:t>.</w:t>
       </w:r>
     </w:p>
     <w:p>
@@ -4216,8 +4554,13 @@
             </w:tcMar>
           </w:tcPr>
           <w:p>
-            <w:r>
-              <w:t>Latest stable</w:t>
+            <w:proofErr w:type="spellStart"/>
+            <w:r>
+              <w:t>Latest</w:t>
+            </w:r>
+            <w:proofErr w:type="spellEnd"/>
+            <w:r>
+              <w:t xml:space="preserve"> stable</w:t>
             </w:r>
           </w:p>
         </w:tc>
@@ -4262,8 +4605,13 @@
             </w:tcMar>
           </w:tcPr>
           <w:p>
-            <w:r>
-              <w:t>Latest stable</w:t>
+            <w:proofErr w:type="spellStart"/>
+            <w:r>
+              <w:t>Latest</w:t>
+            </w:r>
+            <w:proofErr w:type="spellEnd"/>
+            <w:r>
+              <w:t xml:space="preserve"> stable</w:t>
             </w:r>
           </w:p>
         </w:tc>
@@ -4308,8 +4656,13 @@
             </w:tcMar>
           </w:tcPr>
           <w:p>
-            <w:r>
-              <w:t>Latest stable</w:t>
+            <w:proofErr w:type="spellStart"/>
+            <w:r>
+              <w:t>Latest</w:t>
+            </w:r>
+            <w:proofErr w:type="spellEnd"/>
+            <w:r>
+              <w:t xml:space="preserve"> stable</w:t>
             </w:r>
           </w:p>
         </w:tc>
@@ -4354,8 +4707,21 @@
             </w:tcMar>
           </w:tcPr>
           <w:p>
-            <w:r>
-              <w:t>Latest stable (macOS)</w:t>
+            <w:proofErr w:type="spellStart"/>
+            <w:r>
+              <w:t>Latest</w:t>
+            </w:r>
+            <w:proofErr w:type="spellEnd"/>
+            <w:r>
+              <w:t xml:space="preserve"> stable (</w:t>
+            </w:r>
+            <w:proofErr w:type="spellStart"/>
+            <w:r>
+              <w:t>macOS</w:t>
+            </w:r>
+            <w:proofErr w:type="spellEnd"/>
+            <w:r>
+              <w:t>)</w:t>
             </w:r>
           </w:p>
         </w:tc>
@@ -4493,9 +4859,11 @@
             </w:tcMar>
           </w:tcPr>
           <w:p>
+            <w:proofErr w:type="spellStart"/>
             <w:r>
               <w:t>Playwright</w:t>
             </w:r>
+            <w:proofErr w:type="spellEnd"/>
           </w:p>
         </w:tc>
       </w:tr>
@@ -4571,8 +4939,13 @@
             </w:tcMar>
           </w:tcPr>
           <w:p>
-            <w:r>
-              <w:t>Upload fixtures</w:t>
+            <w:proofErr w:type="spellStart"/>
+            <w:r>
+              <w:t>Upload</w:t>
+            </w:r>
+            <w:proofErr w:type="spellEnd"/>
+            <w:r>
+              <w:t xml:space="preserve"> fixtures</w:t>
             </w:r>
           </w:p>
         </w:tc>
@@ -4810,8 +5183,21 @@
             </w:tcMar>
           </w:tcPr>
           <w:p>
-            <w:r>
-              <w:t>Before testing starts</w:t>
+            <w:proofErr w:type="spellStart"/>
+            <w:r>
+              <w:t>Before</w:t>
+            </w:r>
+            <w:proofErr w:type="spellEnd"/>
+            <w:r>
+              <w:t xml:space="preserve"> </w:t>
+            </w:r>
+            <w:proofErr w:type="spellStart"/>
+            <w:r>
+              <w:t>testing</w:t>
+            </w:r>
+            <w:proofErr w:type="spellEnd"/>
+            <w:r>
+              <w:t xml:space="preserve"> starts</w:t>
             </w:r>
           </w:p>
         </w:tc>
@@ -4833,7 +5219,23 @@
           </w:tcPr>
           <w:p>
             <w:r>
-              <w:t>Jonathan Berlemont / [Functional Analyst]</w:t>
+              <w:t>Jonathan Berlemont / [</w:t>
+            </w:r>
+            <w:proofErr w:type="spellStart"/>
+            <w:r>
+              <w:t>Functional</w:t>
+            </w:r>
+            <w:proofErr w:type="spellEnd"/>
+            <w:r>
+              <w:t xml:space="preserve"> </w:t>
+            </w:r>
+            <w:proofErr w:type="spellStart"/>
+            <w:r>
+              <w:t>Analyst</w:t>
+            </w:r>
+            <w:proofErr w:type="spellEnd"/>
+            <w:r>
+              <w:t>]</w:t>
             </w:r>
           </w:p>
         </w:tc>
@@ -4857,8 +5259,13 @@
           </w:tcPr>
           <w:p>
             <w:r>
-              <w:t>Test server available</w:t>
-            </w:r>
+              <w:t xml:space="preserve">Test server </w:t>
+            </w:r>
+            <w:proofErr w:type="spellStart"/>
+            <w:r>
+              <w:t>available</w:t>
+            </w:r>
+            <w:proofErr w:type="spellEnd"/>
           </w:p>
         </w:tc>
         <w:tc>
@@ -4901,7 +5308,15 @@
           </w:tcPr>
           <w:p>
             <w:r>
-              <w:t>[Developer]</w:t>
+              <w:t>[</w:t>
+            </w:r>
+            <w:proofErr w:type="spellStart"/>
+            <w:r>
+              <w:t>Developer</w:t>
+            </w:r>
+            <w:proofErr w:type="spellEnd"/>
+            <w:r>
+              <w:t>]</w:t>
             </w:r>
           </w:p>
         </w:tc>
@@ -5000,9 +5415,19 @@
             </w:tcMar>
           </w:tcPr>
           <w:p>
-            <w:r>
-              <w:t>Playwright scripts written</w:t>
-            </w:r>
+            <w:proofErr w:type="spellStart"/>
+            <w:r>
+              <w:t>Playwright</w:t>
+            </w:r>
+            <w:proofErr w:type="spellEnd"/>
+            <w:r>
+              <w:t xml:space="preserve"> scripts </w:t>
+            </w:r>
+            <w:proofErr w:type="spellStart"/>
+            <w:r>
+              <w:t>written</w:t>
+            </w:r>
+            <w:proofErr w:type="spellEnd"/>
           </w:p>
         </w:tc>
         <w:tc>
@@ -5069,8 +5494,13 @@
           </w:tcPr>
           <w:p>
             <w:r>
-              <w:t>Full test suite executed</w:t>
-            </w:r>
+              <w:t xml:space="preserve">Full test suite </w:t>
+            </w:r>
+            <w:proofErr w:type="spellStart"/>
+            <w:r>
+              <w:t>executed</w:t>
+            </w:r>
+            <w:proofErr w:type="spellEnd"/>
           </w:p>
         </w:tc>
         <w:tc>
@@ -5136,9 +5566,27 @@
             </w:tcMar>
           </w:tcPr>
           <w:p>
-            <w:r>
-              <w:t>Integration testing completed</w:t>
-            </w:r>
+            <w:proofErr w:type="spellStart"/>
+            <w:r>
+              <w:t>Integration</w:t>
+            </w:r>
+            <w:proofErr w:type="spellEnd"/>
+            <w:r>
+              <w:t xml:space="preserve"> </w:t>
+            </w:r>
+            <w:proofErr w:type="spellStart"/>
+            <w:r>
+              <w:t>testing</w:t>
+            </w:r>
+            <w:proofErr w:type="spellEnd"/>
+            <w:r>
+              <w:t xml:space="preserve"> </w:t>
+            </w:r>
+            <w:proofErr w:type="spellStart"/>
+            <w:r>
+              <w:t>completed</w:t>
+            </w:r>
+            <w:proofErr w:type="spellEnd"/>
           </w:p>
         </w:tc>
         <w:tc>
@@ -5181,7 +5629,15 @@
           </w:tcPr>
           <w:p>
             <w:r>
-              <w:t>Jonathan Berlemont + [Developer]</w:t>
+              <w:t>Jonathan Berlemont + [</w:t>
+            </w:r>
+            <w:proofErr w:type="spellStart"/>
+            <w:r>
+              <w:t>Developer</w:t>
+            </w:r>
+            <w:proofErr w:type="spellEnd"/>
+            <w:r>
+              <w:t>]</w:t>
             </w:r>
           </w:p>
         </w:tc>
@@ -5204,9 +5660,27 @@
             </w:tcMar>
           </w:tcPr>
           <w:p>
-            <w:r>
-              <w:t>Defects fixed and retested</w:t>
-            </w:r>
+            <w:proofErr w:type="spellStart"/>
+            <w:r>
+              <w:t>Defects</w:t>
+            </w:r>
+            <w:proofErr w:type="spellEnd"/>
+            <w:r>
+              <w:t xml:space="preserve"> </w:t>
+            </w:r>
+            <w:proofErr w:type="spellStart"/>
+            <w:r>
+              <w:t>fixed</w:t>
+            </w:r>
+            <w:proofErr w:type="spellEnd"/>
+            <w:r>
+              <w:t xml:space="preserve"> and </w:t>
+            </w:r>
+            <w:proofErr w:type="spellStart"/>
+            <w:r>
+              <w:t>retested</w:t>
+            </w:r>
+            <w:proofErr w:type="spellEnd"/>
           </w:p>
         </w:tc>
         <w:tc>
@@ -5248,8 +5722,13 @@
             </w:tcMar>
           </w:tcPr>
           <w:p>
-            <w:r>
-              <w:t>Development team</w:t>
+            <w:proofErr w:type="spellStart"/>
+            <w:r>
+              <w:t>Development</w:t>
+            </w:r>
+            <w:proofErr w:type="spellEnd"/>
+            <w:r>
+              <w:t xml:space="preserve"> team</w:t>
             </w:r>
           </w:p>
         </w:tc>
@@ -5273,8 +5752,13 @@
           </w:tcPr>
           <w:p>
             <w:r>
-              <w:t>Sprint review</w:t>
-            </w:r>
+              <w:t xml:space="preserve">Sprint </w:t>
+            </w:r>
+            <w:proofErr w:type="spellStart"/>
+            <w:r>
+              <w:t>review</w:t>
+            </w:r>
+            <w:proofErr w:type="spellEnd"/>
           </w:p>
         </w:tc>
         <w:tc>
@@ -5362,9 +5846,19 @@
             </w:tcMar>
           </w:tcPr>
           <w:p>
-            <w:r>
-              <w:t>After sprint review</w:t>
-            </w:r>
+            <w:proofErr w:type="spellStart"/>
+            <w:r>
+              <w:t>After</w:t>
+            </w:r>
+            <w:proofErr w:type="spellEnd"/>
+            <w:r>
+              <w:t xml:space="preserve"> sprint </w:t>
+            </w:r>
+            <w:proofErr w:type="spellStart"/>
+            <w:r>
+              <w:t>review</w:t>
+            </w:r>
+            <w:proofErr w:type="spellEnd"/>
           </w:p>
         </w:tc>
         <w:tc>
@@ -5385,7 +5879,15 @@
           </w:tcPr>
           <w:p>
             <w:r>
-              <w:t>[Client representatives]</w:t>
+              <w:t xml:space="preserve">[Client </w:t>
+            </w:r>
+            <w:proofErr w:type="spellStart"/>
+            <w:r>
+              <w:t>representatives</w:t>
+            </w:r>
+            <w:proofErr w:type="spellEnd"/>
+            <w:r>
+              <w:t>]</w:t>
             </w:r>
           </w:p>
         </w:tc>
@@ -5409,8 +5911,14 @@
           </w:tcPr>
           <w:p>
             <w:r>
-              <w:t>Production deployment</w:t>
-            </w:r>
+              <w:lastRenderedPageBreak/>
+              <w:t xml:space="preserve">Production </w:t>
+            </w:r>
+            <w:proofErr w:type="spellStart"/>
+            <w:r>
+              <w:t>deployment</w:t>
+            </w:r>
+            <w:proofErr w:type="spellEnd"/>
           </w:p>
         </w:tc>
         <w:tc>
@@ -5461,7 +5969,15 @@
           </w:tcPr>
           <w:p>
             <w:r>
-              <w:t>[Developer]</w:t>
+              <w:t>[</w:t>
+            </w:r>
+            <w:proofErr w:type="spellStart"/>
+            <w:r>
+              <w:t>Developer</w:t>
+            </w:r>
+            <w:proofErr w:type="spellEnd"/>
+            <w:r>
+              <w:t>]</w:t>
             </w:r>
           </w:p>
         </w:tc>
@@ -5481,9 +5997,14 @@
       </w:pPr>
       <w:bookmarkStart w:id="18" w:name="_Toc231855891"/>
       <w:r>
-        <w:t>7. Control Procedures</w:t>
+        <w:t xml:space="preserve">7. Control </w:t>
+      </w:r>
+      <w:proofErr w:type="spellStart"/>
+      <w:r>
+        <w:t>Procedures</w:t>
       </w:r>
       <w:bookmarkEnd w:id="18"/>
+      <w:proofErr w:type="spellEnd"/>
     </w:p>
     <w:p>
       <w:pPr>
@@ -5491,7 +6012,15 @@
       </w:pPr>
       <w:bookmarkStart w:id="19" w:name="_Toc231855892"/>
       <w:r>
-        <w:t>7.1 Reporting issues</w:t>
+        <w:t xml:space="preserve">7.1 </w:t>
+      </w:r>
+      <w:proofErr w:type="spellStart"/>
+      <w:r>
+        <w:t>Reporting</w:t>
+      </w:r>
+      <w:proofErr w:type="spellEnd"/>
+      <w:r>
+        <w:t xml:space="preserve"> issues</w:t>
       </w:r>
       <w:bookmarkEnd w:id="19"/>
     </w:p>
@@ -5505,8 +6034,29 @@
         </w:rPr>
         <w:t xml:space="preserve">Any issue found during testing is logged as a bug in Azure DevOps. </w:t>
       </w:r>
-      <w:r>
-        <w:t>Each bug report should include:</w:t>
+      <w:proofErr w:type="spellStart"/>
+      <w:r>
+        <w:t>Each</w:t>
+      </w:r>
+      <w:proofErr w:type="spellEnd"/>
+      <w:r>
+        <w:t xml:space="preserve"> bug report </w:t>
+      </w:r>
+      <w:proofErr w:type="spellStart"/>
+      <w:r>
+        <w:t>should</w:t>
+      </w:r>
+      <w:proofErr w:type="spellEnd"/>
+      <w:r>
+        <w:t xml:space="preserve"> </w:t>
+      </w:r>
+      <w:proofErr w:type="spellStart"/>
+      <w:r>
+        <w:t>include</w:t>
+      </w:r>
+      <w:proofErr w:type="spellEnd"/>
+      <w:r>
+        <w:t>:</w:t>
       </w:r>
     </w:p>
     <w:p>
@@ -5556,8 +6106,21 @@
         </w:numPr>
         <w:spacing w:before="40" w:after="40"/>
       </w:pPr>
-      <w:r>
-        <w:t>Steps to reproduce.</w:t>
+      <w:proofErr w:type="spellStart"/>
+      <w:r>
+        <w:t>Steps</w:t>
+      </w:r>
+      <w:proofErr w:type="spellEnd"/>
+      <w:r>
+        <w:t xml:space="preserve"> to </w:t>
+      </w:r>
+      <w:proofErr w:type="spellStart"/>
+      <w:r>
+        <w:t>reproduce</w:t>
+      </w:r>
+      <w:proofErr w:type="spellEnd"/>
+      <w:r>
+        <w:t>.</w:t>
       </w:r>
     </w:p>
     <w:p>
@@ -5608,7 +6171,23 @@
         <w:spacing w:before="40" w:after="40"/>
       </w:pPr>
       <w:r>
-        <w:t>Browser and environment details.</w:t>
+        <w:t xml:space="preserve">Browser and </w:t>
+      </w:r>
+      <w:proofErr w:type="spellStart"/>
+      <w:r>
+        <w:t>environment</w:t>
+      </w:r>
+      <w:proofErr w:type="spellEnd"/>
+      <w:r>
+        <w:t xml:space="preserve"> </w:t>
+      </w:r>
+      <w:proofErr w:type="spellStart"/>
+      <w:r>
+        <w:t>details</w:t>
+      </w:r>
+      <w:proofErr w:type="spellEnd"/>
+      <w:r>
+        <w:t>.</w:t>
       </w:r>
     </w:p>
     <w:p>
@@ -5665,7 +6244,39 @@
         <w:t xml:space="preserve">If something comes up during testing that was not in the original functional analysis, it gets logged as a new work item in Azure DevOps. It needs to be estimated and approved before any work starts on it. </w:t>
       </w:r>
       <w:r>
-        <w:t>The following changes are already known and logged:</w:t>
+        <w:t xml:space="preserve">The </w:t>
+      </w:r>
+      <w:proofErr w:type="spellStart"/>
+      <w:r>
+        <w:t>following</w:t>
+      </w:r>
+      <w:proofErr w:type="spellEnd"/>
+      <w:r>
+        <w:t xml:space="preserve"> changes are </w:t>
+      </w:r>
+      <w:proofErr w:type="spellStart"/>
+      <w:r>
+        <w:t>already</w:t>
+      </w:r>
+      <w:proofErr w:type="spellEnd"/>
+      <w:r>
+        <w:t xml:space="preserve"> </w:t>
+      </w:r>
+      <w:proofErr w:type="spellStart"/>
+      <w:r>
+        <w:t>known</w:t>
+      </w:r>
+      <w:proofErr w:type="spellEnd"/>
+      <w:r>
+        <w:t xml:space="preserve"> and </w:t>
+      </w:r>
+      <w:proofErr w:type="spellStart"/>
+      <w:r>
+        <w:t>logged</w:t>
+      </w:r>
+      <w:proofErr w:type="spellEnd"/>
+      <w:r>
+        <w:t>:</w:t>
       </w:r>
     </w:p>
     <w:p>
@@ -5680,11 +6291,19 @@
           <w:lang w:val="en-US"/>
         </w:rPr>
       </w:pPr>
-      <w:r>
-        <w:rPr>
-          <w:lang w:val="en-US"/>
-        </w:rPr>
-        <w:t>Workpackage categories 'General' and 'Transversal' added to the listing page (Story ID: 49399).</w:t>
+      <w:proofErr w:type="spellStart"/>
+      <w:r>
+        <w:rPr>
+          <w:lang w:val="en-US"/>
+        </w:rPr>
+        <w:t>Workpackage</w:t>
+      </w:r>
+      <w:proofErr w:type="spellEnd"/>
+      <w:r>
+        <w:rPr>
+          <w:lang w:val="en-US"/>
+        </w:rPr>
+        <w:t xml:space="preserve"> categories 'General' and 'Transversal' added to the listing page (Story ID: 49399).</w:t>
       </w:r>
     </w:p>
     <w:p>
@@ -5870,6 +6489,7 @@
             </w:tcMar>
           </w:tcPr>
           <w:p>
+            <w:proofErr w:type="spellStart"/>
             <w:r>
               <w:rPr>
                 <w:b/>
@@ -5877,6 +6497,7 @@
               </w:rPr>
               <w:t>Feature</w:t>
             </w:r>
+            <w:proofErr w:type="spellEnd"/>
           </w:p>
         </w:tc>
         <w:tc>
@@ -5897,6 +6518,7 @@
             </w:tcMar>
           </w:tcPr>
           <w:p>
+            <w:proofErr w:type="spellStart"/>
             <w:r>
               <w:rPr>
                 <w:b/>
@@ -5904,6 +6526,7 @@
               </w:rPr>
               <w:t>Priority</w:t>
             </w:r>
+            <w:proofErr w:type="spellEnd"/>
           </w:p>
         </w:tc>
       </w:tr>
@@ -5947,9 +6570,27 @@
             </w:tcMar>
           </w:tcPr>
           <w:p>
-            <w:r>
-              <w:t>Homepage loads correctly</w:t>
-            </w:r>
+            <w:proofErr w:type="spellStart"/>
+            <w:r>
+              <w:t>Homepage</w:t>
+            </w:r>
+            <w:proofErr w:type="spellEnd"/>
+            <w:r>
+              <w:t xml:space="preserve"> </w:t>
+            </w:r>
+            <w:proofErr w:type="spellStart"/>
+            <w:r>
+              <w:t>loads</w:t>
+            </w:r>
+            <w:proofErr w:type="spellEnd"/>
+            <w:r>
+              <w:t xml:space="preserve"> </w:t>
+            </w:r>
+            <w:proofErr w:type="spellStart"/>
+            <w:r>
+              <w:t>correctly</w:t>
+            </w:r>
+            <w:proofErr w:type="spellEnd"/>
           </w:p>
         </w:tc>
         <w:tc>
@@ -6222,6 +6863,7 @@
           </w:tcPr>
           <w:p>
             <w:r>
+              <w:lastRenderedPageBreak/>
               <w:t>48689</w:t>
             </w:r>
           </w:p>
@@ -6856,12 +7498,28 @@
                 <w:lang w:val="en-US"/>
               </w:rPr>
             </w:pPr>
-            <w:r>
-              <w:rPr>
-                <w:lang w:val="en-US"/>
-              </w:rPr>
-              <w:t>Workpackages overview page loads and lists all workpackages</w:t>
-            </w:r>
+            <w:proofErr w:type="spellStart"/>
+            <w:r>
+              <w:rPr>
+                <w:lang w:val="en-US"/>
+              </w:rPr>
+              <w:t>Workpackages</w:t>
+            </w:r>
+            <w:proofErr w:type="spellEnd"/>
+            <w:r>
+              <w:rPr>
+                <w:lang w:val="en-US"/>
+              </w:rPr>
+              <w:t xml:space="preserve"> overview page loads and lists all </w:t>
+            </w:r>
+            <w:proofErr w:type="spellStart"/>
+            <w:r>
+              <w:rPr>
+                <w:lang w:val="en-US"/>
+              </w:rPr>
+              <w:t>workpackages</w:t>
+            </w:r>
+            <w:proofErr w:type="spellEnd"/>
           </w:p>
         </w:tc>
         <w:tc>
@@ -7388,11 +8046,19 @@
                 <w:lang w:val="en-US"/>
               </w:rPr>
             </w:pPr>
-            <w:r>
-              <w:rPr>
-                <w:lang w:val="en-US"/>
-              </w:rPr>
-              <w:t>Workpackage detail page shows all fields and linked content correctly</w:t>
+            <w:proofErr w:type="spellStart"/>
+            <w:r>
+              <w:rPr>
+                <w:lang w:val="en-US"/>
+              </w:rPr>
+              <w:t>Workpackage</w:t>
+            </w:r>
+            <w:proofErr w:type="spellEnd"/>
+            <w:r>
+              <w:rPr>
+                <w:lang w:val="en-US"/>
+              </w:rPr>
+              <w:t xml:space="preserve"> detail page shows all fields and linked content correctly</w:t>
             </w:r>
           </w:p>
         </w:tc>
@@ -7583,9 +8249,14 @@
       </w:pPr>
       <w:bookmarkStart w:id="23" w:name="_Toc231855896"/>
       <w:r>
-        <w:t>8.2 Content editor features</w:t>
+        <w:t xml:space="preserve">8.2 Content editor </w:t>
+      </w:r>
+      <w:proofErr w:type="spellStart"/>
+      <w:r>
+        <w:t>features</w:t>
       </w:r>
       <w:bookmarkEnd w:id="23"/>
+      <w:proofErr w:type="spellEnd"/>
     </w:p>
     <w:tbl>
       <w:tblPr>
@@ -7655,6 +8326,7 @@
             </w:tcMar>
           </w:tcPr>
           <w:p>
+            <w:proofErr w:type="spellStart"/>
             <w:r>
               <w:rPr>
                 <w:b/>
@@ -7662,6 +8334,7 @@
               </w:rPr>
               <w:t>Feature</w:t>
             </w:r>
+            <w:proofErr w:type="spellEnd"/>
           </w:p>
         </w:tc>
         <w:tc>
@@ -7682,6 +8355,7 @@
             </w:tcMar>
           </w:tcPr>
           <w:p>
+            <w:proofErr w:type="spellStart"/>
             <w:r>
               <w:rPr>
                 <w:b/>
@@ -7689,6 +8363,7 @@
               </w:rPr>
               <w:t>Priority</w:t>
             </w:r>
+            <w:proofErr w:type="spellEnd"/>
           </w:p>
         </w:tc>
       </w:tr>
@@ -7733,8 +8408,29 @@
           </w:tcPr>
           <w:p>
             <w:r>
-              <w:t>Event: create, edit, delete</w:t>
-            </w:r>
+              <w:t xml:space="preserve">Event: </w:t>
+            </w:r>
+            <w:proofErr w:type="spellStart"/>
+            <w:r>
+              <w:t>create</w:t>
+            </w:r>
+            <w:proofErr w:type="spellEnd"/>
+            <w:r>
+              <w:t xml:space="preserve">, </w:t>
+            </w:r>
+            <w:proofErr w:type="spellStart"/>
+            <w:r>
+              <w:t>edit</w:t>
+            </w:r>
+            <w:proofErr w:type="spellEnd"/>
+            <w:r>
+              <w:t xml:space="preserve">, </w:t>
+            </w:r>
+            <w:proofErr w:type="spellStart"/>
+            <w:r>
+              <w:t>delete</w:t>
+            </w:r>
+            <w:proofErr w:type="spellEnd"/>
           </w:p>
         </w:tc>
         <w:tc>
@@ -7801,8 +8497,29 @@
           </w:tcPr>
           <w:p>
             <w:r>
-              <w:t>News: create, edit, delete</w:t>
-            </w:r>
+              <w:t xml:space="preserve">News: </w:t>
+            </w:r>
+            <w:proofErr w:type="spellStart"/>
+            <w:r>
+              <w:t>create</w:t>
+            </w:r>
+            <w:proofErr w:type="spellEnd"/>
+            <w:r>
+              <w:t xml:space="preserve">, </w:t>
+            </w:r>
+            <w:proofErr w:type="spellStart"/>
+            <w:r>
+              <w:t>edit</w:t>
+            </w:r>
+            <w:proofErr w:type="spellEnd"/>
+            <w:r>
+              <w:t xml:space="preserve">, </w:t>
+            </w:r>
+            <w:proofErr w:type="spellStart"/>
+            <w:r>
+              <w:t>delete</w:t>
+            </w:r>
+            <w:proofErr w:type="spellEnd"/>
           </w:p>
         </w:tc>
         <w:tc>
@@ -7847,6 +8564,7 @@
           </w:tcPr>
           <w:p>
             <w:r>
+              <w:lastRenderedPageBreak/>
               <w:t>47466 / 47465 / 47464</w:t>
             </w:r>
           </w:p>
@@ -7868,9 +8586,35 @@
             </w:tcMar>
           </w:tcPr>
           <w:p>
-            <w:r>
-              <w:t>Deliverable: create, edit, delete</w:t>
-            </w:r>
+            <w:proofErr w:type="spellStart"/>
+            <w:r>
+              <w:t>Deliverable</w:t>
+            </w:r>
+            <w:proofErr w:type="spellEnd"/>
+            <w:r>
+              <w:t xml:space="preserve">: </w:t>
+            </w:r>
+            <w:proofErr w:type="spellStart"/>
+            <w:r>
+              <w:t>create</w:t>
+            </w:r>
+            <w:proofErr w:type="spellEnd"/>
+            <w:r>
+              <w:t xml:space="preserve">, </w:t>
+            </w:r>
+            <w:proofErr w:type="spellStart"/>
+            <w:r>
+              <w:t>edit</w:t>
+            </w:r>
+            <w:proofErr w:type="spellEnd"/>
+            <w:r>
+              <w:t xml:space="preserve">, </w:t>
+            </w:r>
+            <w:proofErr w:type="spellStart"/>
+            <w:r>
+              <w:t>delete</w:t>
+            </w:r>
+            <w:proofErr w:type="spellEnd"/>
           </w:p>
         </w:tc>
         <w:tc>
@@ -7937,8 +8681,29 @@
           </w:tcPr>
           <w:p>
             <w:r>
-              <w:t>Newsletter: create, edit, delete</w:t>
-            </w:r>
+              <w:t xml:space="preserve">Newsletter: </w:t>
+            </w:r>
+            <w:proofErr w:type="spellStart"/>
+            <w:r>
+              <w:t>create</w:t>
+            </w:r>
+            <w:proofErr w:type="spellEnd"/>
+            <w:r>
+              <w:t xml:space="preserve">, </w:t>
+            </w:r>
+            <w:proofErr w:type="spellStart"/>
+            <w:r>
+              <w:t>edit</w:t>
+            </w:r>
+            <w:proofErr w:type="spellEnd"/>
+            <w:r>
+              <w:t xml:space="preserve">, </w:t>
+            </w:r>
+            <w:proofErr w:type="spellStart"/>
+            <w:r>
+              <w:t>delete</w:t>
+            </w:r>
+            <w:proofErr w:type="spellEnd"/>
           </w:p>
         </w:tc>
         <w:tc>
@@ -8080,9 +8845,35 @@
             </w:tcMar>
           </w:tcPr>
           <w:p>
-            <w:r>
-              <w:t>Workpackage: create, edit, delete</w:t>
-            </w:r>
+            <w:proofErr w:type="spellStart"/>
+            <w:r>
+              <w:t>Workpackage</w:t>
+            </w:r>
+            <w:proofErr w:type="spellEnd"/>
+            <w:r>
+              <w:t xml:space="preserve">: </w:t>
+            </w:r>
+            <w:proofErr w:type="spellStart"/>
+            <w:r>
+              <w:t>create</w:t>
+            </w:r>
+            <w:proofErr w:type="spellEnd"/>
+            <w:r>
+              <w:t xml:space="preserve">, </w:t>
+            </w:r>
+            <w:proofErr w:type="spellStart"/>
+            <w:r>
+              <w:t>edit</w:t>
+            </w:r>
+            <w:proofErr w:type="spellEnd"/>
+            <w:r>
+              <w:t xml:space="preserve">, </w:t>
+            </w:r>
+            <w:proofErr w:type="spellStart"/>
+            <w:r>
+              <w:t>delete</w:t>
+            </w:r>
+            <w:proofErr w:type="spellEnd"/>
           </w:p>
         </w:tc>
         <w:tc>
@@ -8157,7 +8948,21 @@
               <w:rPr>
                 <w:lang w:val="en-US"/>
               </w:rPr>
-              <w:t>Task (within a Workpackage): create, edit, delete</w:t>
+              <w:t xml:space="preserve">Task (within a </w:t>
+            </w:r>
+            <w:proofErr w:type="spellStart"/>
+            <w:r>
+              <w:rPr>
+                <w:lang w:val="en-US"/>
+              </w:rPr>
+              <w:t>Workpackage</w:t>
+            </w:r>
+            <w:proofErr w:type="spellEnd"/>
+            <w:r>
+              <w:rPr>
+                <w:lang w:val="en-US"/>
+              </w:rPr>
+              <w:t>): create, edit, delete</w:t>
             </w:r>
           </w:p>
         </w:tc>
@@ -8301,8 +9106,29 @@
           </w:tcPr>
           <w:p>
             <w:r>
-              <w:t>Pilot: create, edit, delete</w:t>
-            </w:r>
+              <w:t xml:space="preserve">Pilot: </w:t>
+            </w:r>
+            <w:proofErr w:type="spellStart"/>
+            <w:r>
+              <w:t>create</w:t>
+            </w:r>
+            <w:proofErr w:type="spellEnd"/>
+            <w:r>
+              <w:t xml:space="preserve">, </w:t>
+            </w:r>
+            <w:proofErr w:type="spellStart"/>
+            <w:r>
+              <w:t>edit</w:t>
+            </w:r>
+            <w:proofErr w:type="spellEnd"/>
+            <w:r>
+              <w:t xml:space="preserve">, </w:t>
+            </w:r>
+            <w:proofErr w:type="spellStart"/>
+            <w:r>
+              <w:t>delete</w:t>
+            </w:r>
+            <w:proofErr w:type="spellEnd"/>
           </w:p>
         </w:tc>
         <w:tc>
@@ -8369,8 +9195,29 @@
           </w:tcPr>
           <w:p>
             <w:r>
-              <w:t>Institution: create, edit, delete</w:t>
-            </w:r>
+              <w:t xml:space="preserve">Institution: </w:t>
+            </w:r>
+            <w:proofErr w:type="spellStart"/>
+            <w:r>
+              <w:t>create</w:t>
+            </w:r>
+            <w:proofErr w:type="spellEnd"/>
+            <w:r>
+              <w:t xml:space="preserve">, </w:t>
+            </w:r>
+            <w:proofErr w:type="spellStart"/>
+            <w:r>
+              <w:t>edit</w:t>
+            </w:r>
+            <w:proofErr w:type="spellEnd"/>
+            <w:r>
+              <w:t xml:space="preserve">, </w:t>
+            </w:r>
+            <w:proofErr w:type="spellStart"/>
+            <w:r>
+              <w:t>delete</w:t>
+            </w:r>
+            <w:proofErr w:type="spellEnd"/>
           </w:p>
         </w:tc>
         <w:tc>
@@ -8445,7 +9292,21 @@
               <w:rPr>
                 <w:lang w:val="en-US"/>
               </w:rPr>
-              <w:t>Arm (including colour setting): create, edit, delete</w:t>
+              <w:t xml:space="preserve">Arm (including </w:t>
+            </w:r>
+            <w:proofErr w:type="spellStart"/>
+            <w:r>
+              <w:rPr>
+                <w:lang w:val="en-US"/>
+              </w:rPr>
+              <w:t>colour</w:t>
+            </w:r>
+            <w:proofErr w:type="spellEnd"/>
+            <w:r>
+              <w:rPr>
+                <w:lang w:val="en-US"/>
+              </w:rPr>
+              <w:t xml:space="preserve"> setting): create, edit, delete</w:t>
             </w:r>
           </w:p>
         </w:tc>
@@ -8712,7 +9573,23 @@
       </w:pPr>
       <w:bookmarkStart w:id="24" w:name="_Toc231855897"/>
       <w:r>
-        <w:t>8.3 Integrations and non-functional checks</w:t>
+        <w:t xml:space="preserve">8.3 </w:t>
+      </w:r>
+      <w:proofErr w:type="spellStart"/>
+      <w:r>
+        <w:t>Integrations</w:t>
+      </w:r>
+      <w:proofErr w:type="spellEnd"/>
+      <w:r>
+        <w:t xml:space="preserve"> and non-</w:t>
+      </w:r>
+      <w:proofErr w:type="spellStart"/>
+      <w:r>
+        <w:t>functional</w:t>
+      </w:r>
+      <w:proofErr w:type="spellEnd"/>
+      <w:r>
+        <w:t xml:space="preserve"> checks</w:t>
       </w:r>
       <w:bookmarkEnd w:id="24"/>
     </w:p>
@@ -8784,6 +9661,7 @@
             </w:tcMar>
           </w:tcPr>
           <w:p>
+            <w:proofErr w:type="spellStart"/>
             <w:r>
               <w:rPr>
                 <w:b/>
@@ -8791,6 +9669,7 @@
               </w:rPr>
               <w:t>Feature</w:t>
             </w:r>
+            <w:proofErr w:type="spellEnd"/>
           </w:p>
         </w:tc>
         <w:tc>
@@ -8811,6 +9690,7 @@
             </w:tcMar>
           </w:tcPr>
           <w:p>
+            <w:proofErr w:type="spellStart"/>
             <w:r>
               <w:rPr>
                 <w:b/>
@@ -8818,6 +9698,7 @@
               </w:rPr>
               <w:t>Priority</w:t>
             </w:r>
+            <w:proofErr w:type="spellEnd"/>
           </w:p>
         </w:tc>
       </w:tr>
@@ -8870,7 +9751,21 @@
               <w:rPr>
                 <w:lang w:val="en-US"/>
               </w:rPr>
-              <w:t>Workspace button only visible for authenticated Sciensano IDP users; links to SharePoint</w:t>
+              <w:t xml:space="preserve">Workspace button only visible for authenticated </w:t>
+            </w:r>
+            <w:proofErr w:type="spellStart"/>
+            <w:r>
+              <w:rPr>
+                <w:lang w:val="en-US"/>
+              </w:rPr>
+              <w:t>Sciensano</w:t>
+            </w:r>
+            <w:proofErr w:type="spellEnd"/>
+            <w:r>
+              <w:rPr>
+                <w:lang w:val="en-US"/>
+              </w:rPr>
+              <w:t xml:space="preserve"> IDP users; links to SharePoint</w:t>
             </w:r>
           </w:p>
         </w:tc>
@@ -9098,7 +9993,35 @@
               <w:rPr>
                 <w:lang w:val="en-US"/>
               </w:rPr>
-              <w:t>Newsletter button redirects to the Spotler/Mailpro subscription page</w:t>
+              <w:t xml:space="preserve">Newsletter button redirects to the </w:t>
+            </w:r>
+            <w:proofErr w:type="spellStart"/>
+            <w:r>
+              <w:rPr>
+                <w:lang w:val="en-US"/>
+              </w:rPr>
+              <w:t>Spotler</w:t>
+            </w:r>
+            <w:proofErr w:type="spellEnd"/>
+            <w:r>
+              <w:rPr>
+                <w:lang w:val="en-US"/>
+              </w:rPr>
+              <w:t>/</w:t>
+            </w:r>
+            <w:proofErr w:type="spellStart"/>
+            <w:r>
+              <w:rPr>
+                <w:lang w:val="en-US"/>
+              </w:rPr>
+              <w:t>Mailpro</w:t>
+            </w:r>
+            <w:proofErr w:type="spellEnd"/>
+            <w:r>
+              <w:rPr>
+                <w:lang w:val="en-US"/>
+              </w:rPr>
+              <w:t xml:space="preserve"> subscription page</w:t>
             </w:r>
           </w:p>
         </w:tc>
@@ -9296,6 +10219,7 @@
           </w:tcPr>
           <w:p>
             <w:r>
+              <w:lastRenderedPageBreak/>
               <w:t>FA §VI.B.2</w:t>
             </w:r>
           </w:p>
@@ -9444,9 +10368,22 @@
       </w:pPr>
       <w:bookmarkStart w:id="25" w:name="_Toc231855898"/>
       <w:r>
-        <w:t>9. Features Not to Be Tested</w:t>
+        <w:t xml:space="preserve">9. </w:t>
+      </w:r>
+      <w:proofErr w:type="spellStart"/>
+      <w:r>
+        <w:t>Features</w:t>
+      </w:r>
+      <w:proofErr w:type="spellEnd"/>
+      <w:r>
+        <w:t xml:space="preserve"> Not to Be </w:t>
+      </w:r>
+      <w:proofErr w:type="spellStart"/>
+      <w:r>
+        <w:t>Tested</w:t>
       </w:r>
       <w:bookmarkEnd w:id="25"/>
+      <w:proofErr w:type="spellEnd"/>
     </w:p>
     <w:tbl>
       <w:tblPr>
@@ -9489,6 +10426,7 @@
             </w:tcMar>
           </w:tcPr>
           <w:p>
+            <w:proofErr w:type="spellStart"/>
             <w:r>
               <w:rPr>
                 <w:b/>
@@ -9496,6 +10434,7 @@
               </w:rPr>
               <w:t>Feature</w:t>
             </w:r>
+            <w:proofErr w:type="spellEnd"/>
           </w:p>
         </w:tc>
         <w:tc>
@@ -9572,8 +10511,21 @@
           </w:tcPr>
           <w:p>
             <w:r>
-              <w:t>Physical mobile / tablet devices</w:t>
-            </w:r>
+              <w:t xml:space="preserve">Physical mobile / </w:t>
+            </w:r>
+            <w:proofErr w:type="spellStart"/>
+            <w:r>
+              <w:t>tablet</w:t>
+            </w:r>
+            <w:proofErr w:type="spellEnd"/>
+            <w:r>
+              <w:t xml:space="preserve"> </w:t>
+            </w:r>
+            <w:proofErr w:type="spellStart"/>
+            <w:r>
+              <w:t>devices</w:t>
+            </w:r>
+            <w:proofErr w:type="spellEnd"/>
           </w:p>
         </w:tc>
         <w:tc>
@@ -9647,8 +10599,13 @@
             </w:tcMar>
           </w:tcPr>
           <w:p>
-            <w:r>
-              <w:t>Sciensano IDP server</w:t>
+            <w:proofErr w:type="spellStart"/>
+            <w:r>
+              <w:t>Sciensano</w:t>
+            </w:r>
+            <w:proofErr w:type="spellEnd"/>
+            <w:r>
+              <w:t xml:space="preserve"> IDP server</w:t>
             </w:r>
           </w:p>
         </w:tc>
@@ -9699,8 +10656,13 @@
             </w:tcMar>
           </w:tcPr>
           <w:p>
-            <w:r>
-              <w:t>Sciensano IT</w:t>
+            <w:proofErr w:type="spellStart"/>
+            <w:r>
+              <w:t>Sciensano</w:t>
+            </w:r>
+            <w:proofErr w:type="spellEnd"/>
+            <w:r>
+              <w:t xml:space="preserve"> IT</w:t>
             </w:r>
           </w:p>
         </w:tc>
@@ -9723,8 +10685,13 @@
             </w:tcMar>
           </w:tcPr>
           <w:p>
-            <w:r>
-              <w:t>Sciensano SharePoint</w:t>
+            <w:proofErr w:type="spellStart"/>
+            <w:r>
+              <w:t>Sciensano</w:t>
+            </w:r>
+            <w:proofErr w:type="spellEnd"/>
+            <w:r>
+              <w:t xml:space="preserve"> SharePoint</w:t>
             </w:r>
           </w:p>
         </w:tc>
@@ -9775,8 +10742,13 @@
             </w:tcMar>
           </w:tcPr>
           <w:p>
-            <w:r>
-              <w:t>Sciensano IT</w:t>
+            <w:proofErr w:type="spellStart"/>
+            <w:r>
+              <w:t>Sciensano</w:t>
+            </w:r>
+            <w:proofErr w:type="spellEnd"/>
+            <w:r>
+              <w:t xml:space="preserve"> IT</w:t>
             </w:r>
           </w:p>
         </w:tc>
@@ -9799,9 +10771,27 @@
             </w:tcMar>
           </w:tcPr>
           <w:p>
-            <w:r>
-              <w:t>Spotler/Mailpro email delivery</w:t>
-            </w:r>
+            <w:proofErr w:type="spellStart"/>
+            <w:r>
+              <w:t>Spotler</w:t>
+            </w:r>
+            <w:proofErr w:type="spellEnd"/>
+            <w:r>
+              <w:t>/</w:t>
+            </w:r>
+            <w:proofErr w:type="spellStart"/>
+            <w:r>
+              <w:t>Mailpro</w:t>
+            </w:r>
+            <w:proofErr w:type="spellEnd"/>
+            <w:r>
+              <w:t xml:space="preserve"> email </w:t>
+            </w:r>
+            <w:proofErr w:type="spellStart"/>
+            <w:r>
+              <w:t>delivery</w:t>
+            </w:r>
+            <w:proofErr w:type="spellEnd"/>
           </w:p>
         </w:tc>
         <w:tc>
@@ -9851,9 +10841,11 @@
             </w:tcMar>
           </w:tcPr>
           <w:p>
+            <w:proofErr w:type="spellStart"/>
             <w:r>
               <w:t>Spotler</w:t>
             </w:r>
+            <w:proofErr w:type="spellEnd"/>
           </w:p>
         </w:tc>
       </w:tr>
@@ -9876,8 +10868,21 @@
           </w:tcPr>
           <w:p>
             <w:r>
-              <w:t>Performance / load testing</w:t>
-            </w:r>
+              <w:t xml:space="preserve">Performance / </w:t>
+            </w:r>
+            <w:proofErr w:type="spellStart"/>
+            <w:r>
+              <w:t>load</w:t>
+            </w:r>
+            <w:proofErr w:type="spellEnd"/>
+            <w:r>
+              <w:t xml:space="preserve"> </w:t>
+            </w:r>
+            <w:proofErr w:type="spellStart"/>
+            <w:r>
+              <w:t>testing</w:t>
+            </w:r>
+            <w:proofErr w:type="spellEnd"/>
           </w:p>
         </w:tc>
         <w:tc>
@@ -9952,8 +10957,21 @@
           </w:tcPr>
           <w:p>
             <w:r>
-              <w:t>Security / penetration testing</w:t>
-            </w:r>
+              <w:t xml:space="preserve">Security / </w:t>
+            </w:r>
+            <w:proofErr w:type="spellStart"/>
+            <w:r>
+              <w:t>penetration</w:t>
+            </w:r>
+            <w:proofErr w:type="spellEnd"/>
+            <w:r>
+              <w:t xml:space="preserve"> </w:t>
+            </w:r>
+            <w:proofErr w:type="spellStart"/>
+            <w:r>
+              <w:t>testing</w:t>
+            </w:r>
+            <w:proofErr w:type="spellEnd"/>
           </w:p>
         </w:tc>
         <w:tc>
@@ -10019,8 +11037,13 @@
             </w:tcMar>
           </w:tcPr>
           <w:p>
-            <w:r>
-              <w:t>Accessibility (WCAG)</w:t>
+            <w:proofErr w:type="spellStart"/>
+            <w:r>
+              <w:t>Accessibility</w:t>
+            </w:r>
+            <w:proofErr w:type="spellEnd"/>
+            <w:r>
+              <w:t xml:space="preserve"> (WCAG)</w:t>
             </w:r>
           </w:p>
         </w:tc>
@@ -10096,8 +11119,13 @@
           </w:tcPr>
           <w:p>
             <w:r>
-              <w:t>Google Analytics report accuracy</w:t>
-            </w:r>
+              <w:t xml:space="preserve">Google Analytics report </w:t>
+            </w:r>
+            <w:proofErr w:type="spellStart"/>
+            <w:r>
+              <w:t>accuracy</w:t>
+            </w:r>
+            <w:proofErr w:type="spellEnd"/>
           </w:p>
         </w:tc>
         <w:tc>
@@ -10168,9 +11196,22 @@
       </w:pPr>
       <w:bookmarkStart w:id="26" w:name="_Toc231855899"/>
       <w:r>
-        <w:t>10. Roles and Responsibilities</w:t>
+        <w:t xml:space="preserve">10. </w:t>
+      </w:r>
+      <w:proofErr w:type="spellStart"/>
+      <w:r>
+        <w:t>Roles</w:t>
+      </w:r>
+      <w:proofErr w:type="spellEnd"/>
+      <w:r>
+        <w:t xml:space="preserve"> and </w:t>
+      </w:r>
+      <w:proofErr w:type="spellStart"/>
+      <w:r>
+        <w:t>Responsibilities</w:t>
       </w:r>
       <w:bookmarkEnd w:id="26"/>
+      <w:proofErr w:type="spellEnd"/>
     </w:p>
     <w:tbl>
       <w:tblPr>
@@ -10214,6 +11255,7 @@
             </w:tcMar>
           </w:tcPr>
           <w:p>
+            <w:proofErr w:type="spellStart"/>
             <w:r>
               <w:rPr>
                 <w:b/>
@@ -10221,6 +11263,7 @@
               </w:rPr>
               <w:t>Role</w:t>
             </w:r>
+            <w:proofErr w:type="spellEnd"/>
           </w:p>
         </w:tc>
         <w:tc>
@@ -10241,6 +11284,7 @@
             </w:tcMar>
           </w:tcPr>
           <w:p>
+            <w:proofErr w:type="spellStart"/>
             <w:r>
               <w:rPr>
                 <w:b/>
@@ -10248,6 +11292,7 @@
               </w:rPr>
               <w:t>Responsibilities</w:t>
             </w:r>
+            <w:proofErr w:type="spellEnd"/>
           </w:p>
         </w:tc>
         <w:tc>
@@ -10324,8 +11369,13 @@
           </w:tcPr>
           <w:p>
             <w:r>
-              <w:t>QA / Developer</w:t>
-            </w:r>
+              <w:t xml:space="preserve">QA / </w:t>
+            </w:r>
+            <w:proofErr w:type="spellStart"/>
+            <w:r>
+              <w:t>Developer</w:t>
+            </w:r>
+            <w:proofErr w:type="spellEnd"/>
           </w:p>
         </w:tc>
         <w:tc>
@@ -10417,9 +11467,11 @@
             </w:tcMar>
           </w:tcPr>
           <w:p>
+            <w:proofErr w:type="spellStart"/>
             <w:r>
               <w:t>Developer</w:t>
             </w:r>
+            <w:proofErr w:type="spellEnd"/>
           </w:p>
         </w:tc>
         <w:tc>
@@ -10470,7 +11522,15 @@
           </w:tcPr>
           <w:p>
             <w:r>
-              <w:t>[Developer]</w:t>
+              <w:t>[</w:t>
+            </w:r>
+            <w:proofErr w:type="spellStart"/>
+            <w:r>
+              <w:t>Developer</w:t>
+            </w:r>
+            <w:proofErr w:type="spellEnd"/>
+            <w:r>
+              <w:t>]</w:t>
             </w:r>
           </w:p>
         </w:tc>
@@ -10511,9 +11571,19 @@
             </w:tcMar>
           </w:tcPr>
           <w:p>
-            <w:r>
-              <w:t>Functional Analyst</w:t>
-            </w:r>
+            <w:proofErr w:type="spellStart"/>
+            <w:r>
+              <w:t>Functional</w:t>
+            </w:r>
+            <w:proofErr w:type="spellEnd"/>
+            <w:r>
+              <w:t xml:space="preserve"> </w:t>
+            </w:r>
+            <w:proofErr w:type="spellStart"/>
+            <w:r>
+              <w:t>Analyst</w:t>
+            </w:r>
+            <w:proofErr w:type="spellEnd"/>
           </w:p>
         </w:tc>
         <w:tc>
@@ -10564,7 +11634,23 @@
           </w:tcPr>
           <w:p>
             <w:r>
-              <w:t>[Functional Analyst]</w:t>
+              <w:t>[</w:t>
+            </w:r>
+            <w:proofErr w:type="spellStart"/>
+            <w:r>
+              <w:t>Functional</w:t>
+            </w:r>
+            <w:proofErr w:type="spellEnd"/>
+            <w:r>
+              <w:t xml:space="preserve"> </w:t>
+            </w:r>
+            <w:proofErr w:type="spellStart"/>
+            <w:r>
+              <w:t>Analyst</w:t>
+            </w:r>
+            <w:proofErr w:type="spellEnd"/>
+            <w:r>
+              <w:t>]</w:t>
             </w:r>
           </w:p>
         </w:tc>
@@ -10606,8 +11692,13 @@
           </w:tcPr>
           <w:p>
             <w:r>
-              <w:t>Client / UAT approver</w:t>
-            </w:r>
+              <w:t xml:space="preserve">Client / UAT </w:t>
+            </w:r>
+            <w:proofErr w:type="spellStart"/>
+            <w:r>
+              <w:t>approver</w:t>
+            </w:r>
+            <w:proofErr w:type="spellEnd"/>
           </w:p>
         </w:tc>
         <w:tc>
@@ -10658,7 +11749,15 @@
           </w:tcPr>
           <w:p>
             <w:r>
-              <w:t>[Client representative]</w:t>
+              <w:t xml:space="preserve">[Client </w:t>
+            </w:r>
+            <w:proofErr w:type="spellStart"/>
+            <w:r>
+              <w:t>representative</w:t>
+            </w:r>
+            <w:proofErr w:type="spellEnd"/>
+            <w:r>
+              <w:t>]</w:t>
             </w:r>
           </w:p>
         </w:tc>
@@ -10696,9 +11795,14 @@
       </w:pPr>
       <w:bookmarkStart w:id="27" w:name="_Toc231855900"/>
       <w:r>
-        <w:t>11. Deliverables</w:t>
+        <w:t xml:space="preserve">11. </w:t>
+      </w:r>
+      <w:proofErr w:type="spellStart"/>
+      <w:r>
+        <w:t>Deliverables</w:t>
       </w:r>
       <w:bookmarkEnd w:id="27"/>
+      <w:proofErr w:type="spellEnd"/>
     </w:p>
     <w:p>
       <w:pPr>
@@ -10763,6 +11867,7 @@
             </w:tcMar>
           </w:tcPr>
           <w:p>
+            <w:proofErr w:type="spellStart"/>
             <w:r>
               <w:rPr>
                 <w:b/>
@@ -10770,6 +11875,7 @@
               </w:rPr>
               <w:t>Deliverable</w:t>
             </w:r>
+            <w:proofErr w:type="spellEnd"/>
           </w:p>
         </w:tc>
         <w:tc>
@@ -10846,7 +11952,15 @@
           </w:tcPr>
           <w:p>
             <w:r>
-              <w:t>Test plan (this document)</w:t>
+              <w:t>Test plan (</w:t>
+            </w:r>
+            <w:proofErr w:type="spellStart"/>
+            <w:r>
+              <w:t>this</w:t>
+            </w:r>
+            <w:proofErr w:type="spellEnd"/>
+            <w:r>
+              <w:t xml:space="preserve"> document)</w:t>
             </w:r>
           </w:p>
         </w:tc>
@@ -10868,7 +11982,23 @@
           </w:tcPr>
           <w:p>
             <w:r>
-              <w:t>Jonathan Berlemont / [Functional Analyst]</w:t>
+              <w:t>Jonathan Berlemont / [</w:t>
+            </w:r>
+            <w:proofErr w:type="spellStart"/>
+            <w:r>
+              <w:t>Functional</w:t>
+            </w:r>
+            <w:proofErr w:type="spellEnd"/>
+            <w:r>
+              <w:t xml:space="preserve"> </w:t>
+            </w:r>
+            <w:proofErr w:type="spellStart"/>
+            <w:r>
+              <w:t>Analyst</w:t>
+            </w:r>
+            <w:proofErr w:type="spellEnd"/>
+            <w:r>
+              <w:t>]</w:t>
             </w:r>
           </w:p>
         </w:tc>
@@ -10889,8 +12019,21 @@
             </w:tcMar>
           </w:tcPr>
           <w:p>
-            <w:r>
-              <w:t>Before testing starts</w:t>
+            <w:proofErr w:type="spellStart"/>
+            <w:r>
+              <w:t>Before</w:t>
+            </w:r>
+            <w:proofErr w:type="spellEnd"/>
+            <w:r>
+              <w:t xml:space="preserve"> </w:t>
+            </w:r>
+            <w:proofErr w:type="spellStart"/>
+            <w:r>
+              <w:t>testing</w:t>
+            </w:r>
+            <w:proofErr w:type="spellEnd"/>
+            <w:r>
+              <w:t xml:space="preserve"> starts</w:t>
             </w:r>
           </w:p>
         </w:tc>
@@ -10913,8 +12056,13 @@
             </w:tcMar>
           </w:tcPr>
           <w:p>
-            <w:r>
-              <w:t>Playwright test scripts</w:t>
+            <w:proofErr w:type="spellStart"/>
+            <w:r>
+              <w:t>Playwright</w:t>
+            </w:r>
+            <w:proofErr w:type="spellEnd"/>
+            <w:r>
+              <w:t xml:space="preserve"> test scripts</w:t>
             </w:r>
           </w:p>
         </w:tc>
@@ -10982,8 +12130,21 @@
           </w:tcPr>
           <w:p>
             <w:r>
-              <w:t>Test execution results</w:t>
-            </w:r>
+              <w:t xml:space="preserve">Test </w:t>
+            </w:r>
+            <w:proofErr w:type="spellStart"/>
+            <w:r>
+              <w:t>execution</w:t>
+            </w:r>
+            <w:proofErr w:type="spellEnd"/>
+            <w:r>
+              <w:t xml:space="preserve"> </w:t>
+            </w:r>
+            <w:proofErr w:type="spellStart"/>
+            <w:r>
+              <w:t>results</w:t>
+            </w:r>
+            <w:proofErr w:type="spellEnd"/>
           </w:p>
         </w:tc>
         <w:tc>
@@ -11118,7 +12279,15 @@
           </w:tcPr>
           <w:p>
             <w:r>
-              <w:t>Test summary report</w:t>
+              <w:t xml:space="preserve">Test </w:t>
+            </w:r>
+            <w:proofErr w:type="spellStart"/>
+            <w:r>
+              <w:t>summary</w:t>
+            </w:r>
+            <w:proofErr w:type="spellEnd"/>
+            <w:r>
+              <w:t xml:space="preserve"> report</w:t>
             </w:r>
           </w:p>
         </w:tc>
@@ -11186,7 +12355,15 @@
           </w:tcPr>
           <w:p>
             <w:r>
-              <w:t>UAT sign-off</w:t>
+              <w:t xml:space="preserve">UAT </w:t>
+            </w:r>
+            <w:proofErr w:type="spellStart"/>
+            <w:r>
+              <w:t>sign</w:t>
+            </w:r>
+            <w:proofErr w:type="spellEnd"/>
+            <w:r>
+              <w:t>-off</w:t>
             </w:r>
           </w:p>
         </w:tc>
@@ -11208,7 +12385,15 @@
           </w:tcPr>
           <w:p>
             <w:r>
-              <w:t>[Client representative]</w:t>
+              <w:t xml:space="preserve">[Client </w:t>
+            </w:r>
+            <w:proofErr w:type="spellStart"/>
+            <w:r>
+              <w:t>representative</w:t>
+            </w:r>
+            <w:proofErr w:type="spellEnd"/>
+            <w:r>
+              <w:t>]</w:t>
             </w:r>
           </w:p>
         </w:tc>
@@ -11229,9 +12414,19 @@
             </w:tcMar>
           </w:tcPr>
           <w:p>
-            <w:r>
-              <w:t>After sprint review</w:t>
-            </w:r>
+            <w:proofErr w:type="spellStart"/>
+            <w:r>
+              <w:t>After</w:t>
+            </w:r>
+            <w:proofErr w:type="spellEnd"/>
+            <w:r>
+              <w:t xml:space="preserve"> sprint </w:t>
+            </w:r>
+            <w:proofErr w:type="spellStart"/>
+            <w:r>
+              <w:t>review</w:t>
+            </w:r>
+            <w:proofErr w:type="spellEnd"/>
           </w:p>
         </w:tc>
       </w:tr>
@@ -11250,9 +12445,14 @@
       </w:pPr>
       <w:bookmarkStart w:id="28" w:name="_Toc231855901"/>
       <w:r>
-        <w:t>12. Dependencies</w:t>
+        <w:t xml:space="preserve">12. </w:t>
+      </w:r>
+      <w:proofErr w:type="spellStart"/>
+      <w:r>
+        <w:t>Dependencies</w:t>
       </w:r>
       <w:bookmarkEnd w:id="28"/>
+      <w:proofErr w:type="spellEnd"/>
     </w:p>
     <w:tbl>
       <w:tblPr>
@@ -11294,6 +12494,7 @@
             </w:tcMar>
           </w:tcPr>
           <w:p>
+            <w:proofErr w:type="spellStart"/>
             <w:r>
               <w:rPr>
                 <w:b/>
@@ -11301,6 +12502,7 @@
               </w:rPr>
               <w:t>Dependency</w:t>
             </w:r>
+            <w:proofErr w:type="spellEnd"/>
           </w:p>
         </w:tc>
         <w:tc>
@@ -11326,8 +12528,17 @@
                 <w:b/>
                 <w:bCs/>
               </w:rPr>
-              <w:t>Impact if not available</w:t>
-            </w:r>
+              <w:t xml:space="preserve">Impact if not </w:t>
+            </w:r>
+            <w:proofErr w:type="spellStart"/>
+            <w:r>
+              <w:rPr>
+                <w:b/>
+                <w:bCs/>
+              </w:rPr>
+              <w:t>available</w:t>
+            </w:r>
+            <w:proofErr w:type="spellEnd"/>
           </w:p>
         </w:tc>
       </w:tr>
@@ -11379,8 +12590,21 @@
             </w:tcMar>
           </w:tcPr>
           <w:p>
-            <w:r>
-              <w:t>Testing cannot start</w:t>
+            <w:proofErr w:type="spellStart"/>
+            <w:r>
+              <w:t>Testing</w:t>
+            </w:r>
+            <w:proofErr w:type="spellEnd"/>
+            <w:r>
+              <w:t xml:space="preserve"> </w:t>
+            </w:r>
+            <w:proofErr w:type="spellStart"/>
+            <w:r>
+              <w:t>cannot</w:t>
+            </w:r>
+            <w:proofErr w:type="spellEnd"/>
+            <w:r>
+              <w:t xml:space="preserve"> start</w:t>
             </w:r>
           </w:p>
         </w:tc>
@@ -11470,11 +12694,19 @@
                 <w:lang w:val="en-US"/>
               </w:rPr>
             </w:pPr>
-            <w:r>
-              <w:rPr>
-                <w:lang w:val="en-US"/>
-              </w:rPr>
-              <w:t>Sciensano IDP working in the test environment</w:t>
+            <w:proofErr w:type="spellStart"/>
+            <w:r>
+              <w:rPr>
+                <w:lang w:val="en-US"/>
+              </w:rPr>
+              <w:t>Sciensano</w:t>
+            </w:r>
+            <w:proofErr w:type="spellEnd"/>
+            <w:r>
+              <w:rPr>
+                <w:lang w:val="en-US"/>
+              </w:rPr>
+              <w:t xml:space="preserve"> IDP working in the test environment</w:t>
             </w:r>
           </w:p>
         </w:tc>
@@ -11527,9 +12759,19 @@
             </w:tcMar>
           </w:tcPr>
           <w:p>
-            <w:r>
-              <w:t>UserCentrics cookie consent configured</w:t>
-            </w:r>
+            <w:proofErr w:type="spellStart"/>
+            <w:r>
+              <w:t>UserCentrics</w:t>
+            </w:r>
+            <w:proofErr w:type="spellEnd"/>
+            <w:r>
+              <w:t xml:space="preserve"> cookie consent </w:t>
+            </w:r>
+            <w:proofErr w:type="spellStart"/>
+            <w:r>
+              <w:t>configured</w:t>
+            </w:r>
+            <w:proofErr w:type="spellEnd"/>
           </w:p>
         </w:tc>
         <w:tc>
@@ -11586,11 +12828,33 @@
                 <w:lang w:val="en-US"/>
               </w:rPr>
             </w:pPr>
-            <w:r>
-              <w:rPr>
-                <w:lang w:val="en-US"/>
-              </w:rPr>
-              <w:t>Spotler/Mailpro newsletter link in place</w:t>
+            <w:proofErr w:type="spellStart"/>
+            <w:r>
+              <w:rPr>
+                <w:lang w:val="en-US"/>
+              </w:rPr>
+              <w:t>Spotler</w:t>
+            </w:r>
+            <w:proofErr w:type="spellEnd"/>
+            <w:r>
+              <w:rPr>
+                <w:lang w:val="en-US"/>
+              </w:rPr>
+              <w:t>/</w:t>
+            </w:r>
+            <w:proofErr w:type="spellStart"/>
+            <w:r>
+              <w:rPr>
+                <w:lang w:val="en-US"/>
+              </w:rPr>
+              <w:t>Mailpro</w:t>
+            </w:r>
+            <w:proofErr w:type="spellEnd"/>
+            <w:r>
+              <w:rPr>
+                <w:lang w:val="en-US"/>
+              </w:rPr>
+              <w:t xml:space="preserve"> newsletter link in place</w:t>
             </w:r>
           </w:p>
         </w:tc>
@@ -11644,8 +12908,13 @@
           </w:tcPr>
           <w:p>
             <w:r>
-              <w:t>Google reCAPTCHA configured</w:t>
-            </w:r>
+              <w:t xml:space="preserve">Google reCAPTCHA </w:t>
+            </w:r>
+            <w:proofErr w:type="spellStart"/>
+            <w:r>
+              <w:t>configured</w:t>
+            </w:r>
+            <w:proofErr w:type="spellEnd"/>
           </w:p>
         </w:tc>
         <w:tc>
@@ -11706,8 +12975,16 @@
               <w:rPr>
                 <w:lang w:val="en-US"/>
               </w:rPr>
-              <w:t>CSV/Excel test data files finalised</w:t>
-            </w:r>
+              <w:t xml:space="preserve">CSV/Excel test data files </w:t>
+            </w:r>
+            <w:proofErr w:type="spellStart"/>
+            <w:r>
+              <w:rPr>
+                <w:lang w:val="en-US"/>
+              </w:rPr>
+              <w:t>finalised</w:t>
+            </w:r>
+            <w:proofErr w:type="spellEnd"/>
           </w:p>
         </w:tc>
         <w:tc>
@@ -11759,9 +13036,19 @@
             </w:tcMar>
           </w:tcPr>
           <w:p>
-            <w:r>
-              <w:t>Upload file fixtures available</w:t>
-            </w:r>
+            <w:proofErr w:type="spellStart"/>
+            <w:r>
+              <w:t>Upload</w:t>
+            </w:r>
+            <w:proofErr w:type="spellEnd"/>
+            <w:r>
+              <w:t xml:space="preserve"> file fixtures </w:t>
+            </w:r>
+            <w:proofErr w:type="spellStart"/>
+            <w:r>
+              <w:t>available</w:t>
+            </w:r>
+            <w:proofErr w:type="spellEnd"/>
           </w:p>
         </w:tc>
         <w:tc>
@@ -11844,8 +13131,21 @@
           </w:tcPr>
           <w:p>
             <w:r>
-              <w:t>UAT cannot proceed</w:t>
-            </w:r>
+              <w:t xml:space="preserve">UAT </w:t>
+            </w:r>
+            <w:proofErr w:type="spellStart"/>
+            <w:r>
+              <w:t>cannot</w:t>
+            </w:r>
+            <w:proofErr w:type="spellEnd"/>
+            <w:r>
+              <w:t xml:space="preserve"> </w:t>
+            </w:r>
+            <w:proofErr w:type="spellStart"/>
+            <w:r>
+              <w:t>proceed</w:t>
+            </w:r>
+            <w:proofErr w:type="spellEnd"/>
           </w:p>
         </w:tc>
       </w:tr>
@@ -11864,6 +13164,7 @@
       </w:pPr>
       <w:bookmarkStart w:id="29" w:name="_Toc231855902"/>
       <w:r>
+        <w:lastRenderedPageBreak/>
         <w:t>13. Risks and Assumptions</w:t>
       </w:r>
       <w:bookmarkEnd w:id="29"/>
@@ -11974,12 +13275,21 @@
             </w:tcMar>
           </w:tcPr>
           <w:p>
+            <w:proofErr w:type="spellStart"/>
             <w:r>
               <w:rPr>
                 <w:b/>
                 <w:bCs/>
               </w:rPr>
-              <w:t>Likelihood (1–5)</w:t>
+              <w:t>Likelihood</w:t>
+            </w:r>
+            <w:proofErr w:type="spellEnd"/>
+            <w:r>
+              <w:rPr>
+                <w:b/>
+                <w:bCs/>
+              </w:rPr>
+              <w:t xml:space="preserve"> (1–5)</w:t>
             </w:r>
           </w:p>
         </w:tc>
@@ -12614,7 +13924,21 @@
         <w:rPr>
           <w:lang w:val="en-US"/>
         </w:rPr>
-        <w:t>The visual design is finalised before UAT.</w:t>
+        <w:t xml:space="preserve">The visual design is </w:t>
+      </w:r>
+      <w:proofErr w:type="spellStart"/>
+      <w:r>
+        <w:rPr>
+          <w:lang w:val="en-US"/>
+        </w:rPr>
+        <w:t>finalised</w:t>
+      </w:r>
+      <w:proofErr w:type="spellEnd"/>
+      <w:r>
+        <w:rPr>
+          <w:lang w:val="en-US"/>
+        </w:rPr>
+        <w:t xml:space="preserve"> before UAT.</w:t>
       </w:r>
     </w:p>
     <w:p>
@@ -12793,9 +14117,11 @@
             </w:tcMar>
           </w:tcPr>
           <w:p>
+            <w:proofErr w:type="spellStart"/>
             <w:r>
               <w:t>Playwright</w:t>
             </w:r>
+            <w:proofErr w:type="spellEnd"/>
           </w:p>
         </w:tc>
       </w:tr>
@@ -12818,8 +14144,13 @@
           </w:tcPr>
           <w:p>
             <w:r>
-              <w:t>Project management / bug tracking</w:t>
-            </w:r>
+              <w:t xml:space="preserve">Project management / bug </w:t>
+            </w:r>
+            <w:proofErr w:type="spellStart"/>
+            <w:r>
+              <w:t>tracking</w:t>
+            </w:r>
+            <w:proofErr w:type="spellEnd"/>
           </w:p>
         </w:tc>
         <w:tc>
@@ -12918,8 +14249,13 @@
           </w:tcPr>
           <w:p>
             <w:r>
-              <w:t>Browser testing</w:t>
-            </w:r>
+              <w:t xml:space="preserve">Browser </w:t>
+            </w:r>
+            <w:proofErr w:type="spellStart"/>
+            <w:r>
+              <w:t>testing</w:t>
+            </w:r>
+            <w:proofErr w:type="spellEnd"/>
           </w:p>
         </w:tc>
         <w:tc>
@@ -12972,8 +14308,14 @@
           </w:tcPr>
           <w:p>
             <w:r>
-              <w:t>Test evidence</w:t>
-            </w:r>
+              <w:lastRenderedPageBreak/>
+              <w:t xml:space="preserve">Test </w:t>
+            </w:r>
+            <w:proofErr w:type="spellStart"/>
+            <w:r>
+              <w:t>evidence</w:t>
+            </w:r>
+            <w:proofErr w:type="spellEnd"/>
           </w:p>
         </w:tc>
         <w:tc>
@@ -13125,6 +14467,7 @@
             </w:tcMar>
           </w:tcPr>
           <w:p>
+            <w:proofErr w:type="spellStart"/>
             <w:r>
               <w:rPr>
                 <w:b/>
@@ -13132,6 +14475,7 @@
               </w:rPr>
               <w:t>Role</w:t>
             </w:r>
+            <w:proofErr w:type="spellEnd"/>
           </w:p>
         </w:tc>
         <w:tc>
@@ -13203,7 +14547,15 @@
           </w:tcPr>
           <w:p>
             <w:r>
-              <w:t>QA / Developer (Author)</w:t>
+              <w:t xml:space="preserve">QA / </w:t>
+            </w:r>
+            <w:proofErr w:type="spellStart"/>
+            <w:r>
+              <w:t>Developer</w:t>
+            </w:r>
+            <w:proofErr w:type="spellEnd"/>
+            <w:r>
+              <w:t xml:space="preserve"> (Author)</w:t>
             </w:r>
           </w:p>
         </w:tc>
@@ -13245,7 +14597,15 @@
           </w:tcPr>
           <w:p>
             <w:r>
-              <w:t>[Developer]</w:t>
+              <w:t>[</w:t>
+            </w:r>
+            <w:proofErr w:type="spellStart"/>
+            <w:r>
+              <w:t>Developer</w:t>
+            </w:r>
+            <w:proofErr w:type="spellEnd"/>
+            <w:r>
+              <w:t>]</w:t>
             </w:r>
           </w:p>
         </w:tc>
@@ -13266,9 +14626,11 @@
             </w:tcMar>
           </w:tcPr>
           <w:p>
+            <w:proofErr w:type="spellStart"/>
             <w:r>
               <w:t>Developer</w:t>
             </w:r>
+            <w:proofErr w:type="spellEnd"/>
           </w:p>
         </w:tc>
         <w:tc>
@@ -13309,7 +14671,23 @@
           </w:tcPr>
           <w:p>
             <w:r>
-              <w:t>[Functional Analyst]</w:t>
+              <w:t>[</w:t>
+            </w:r>
+            <w:proofErr w:type="spellStart"/>
+            <w:r>
+              <w:t>Functional</w:t>
+            </w:r>
+            <w:proofErr w:type="spellEnd"/>
+            <w:r>
+              <w:t xml:space="preserve"> </w:t>
+            </w:r>
+            <w:proofErr w:type="spellStart"/>
+            <w:r>
+              <w:t>Analyst</w:t>
+            </w:r>
+            <w:proofErr w:type="spellEnd"/>
+            <w:r>
+              <w:t>]</w:t>
             </w:r>
           </w:p>
         </w:tc>
@@ -13330,9 +14708,19 @@
             </w:tcMar>
           </w:tcPr>
           <w:p>
-            <w:r>
-              <w:t>Functional Analyst</w:t>
-            </w:r>
+            <w:proofErr w:type="spellStart"/>
+            <w:r>
+              <w:t>Functional</w:t>
+            </w:r>
+            <w:proofErr w:type="spellEnd"/>
+            <w:r>
+              <w:t xml:space="preserve"> </w:t>
+            </w:r>
+            <w:proofErr w:type="spellStart"/>
+            <w:r>
+              <w:t>Analyst</w:t>
+            </w:r>
+            <w:proofErr w:type="spellEnd"/>
           </w:p>
         </w:tc>
         <w:tc>
@@ -13373,7 +14761,15 @@
           </w:tcPr>
           <w:p>
             <w:r>
-              <w:t>[Client representative]</w:t>
+              <w:t xml:space="preserve">[Client </w:t>
+            </w:r>
+            <w:proofErr w:type="spellStart"/>
+            <w:r>
+              <w:t>representative</w:t>
+            </w:r>
+            <w:proofErr w:type="spellEnd"/>
+            <w:r>
+              <w:t>]</w:t>
             </w:r>
           </w:p>
         </w:tc>
@@ -13395,8 +14791,13 @@
           </w:tcPr>
           <w:p>
             <w:r>
-              <w:t>UAT approver</w:t>
-            </w:r>
+              <w:t xml:space="preserve">UAT </w:t>
+            </w:r>
+            <w:proofErr w:type="spellStart"/>
+            <w:r>
+              <w:t>approver</w:t>
+            </w:r>
+            <w:proofErr w:type="spellEnd"/>
           </w:p>
         </w:tc>
         <w:tc>
@@ -13462,7 +14863,7 @@
         <w:sz w:val="18"/>
         <w:szCs w:val="18"/>
       </w:rPr>
-      <w:t xml:space="preserve">JAPCM Test Plan V0.1  |  </w:t>
+      <w:t xml:space="preserve">JAPCM Test Plan V1  |  </w:t>
     </w:r>
     <w:r>
       <w:rPr>
@@ -14313,6 +15714,48 @@
       <w:ind w:left="220"/>
     </w:pPr>
   </w:style>
+  <w:style w:type="paragraph" w:styleId="En-tte">
+    <w:name w:val="header"/>
+    <w:basedOn w:val="Normal"/>
+    <w:link w:val="En-tteCar"/>
+    <w:uiPriority w:val="99"/>
+    <w:unhideWhenUsed/>
+    <w:rsid w:val="00696FF0"/>
+    <w:pPr>
+      <w:tabs>
+        <w:tab w:val="center" w:pos="4536"/>
+        <w:tab w:val="right" w:pos="9072"/>
+      </w:tabs>
+    </w:pPr>
+  </w:style>
+  <w:style w:type="character" w:customStyle="1" w:styleId="En-tteCar">
+    <w:name w:val="En-tête Car"/>
+    <w:basedOn w:val="Policepardfaut"/>
+    <w:link w:val="En-tte"/>
+    <w:uiPriority w:val="99"/>
+    <w:rsid w:val="00696FF0"/>
+  </w:style>
+  <w:style w:type="paragraph" w:styleId="Pieddepage">
+    <w:name w:val="footer"/>
+    <w:basedOn w:val="Normal"/>
+    <w:link w:val="PieddepageCar"/>
+    <w:uiPriority w:val="99"/>
+    <w:unhideWhenUsed/>
+    <w:rsid w:val="00696FF0"/>
+    <w:pPr>
+      <w:tabs>
+        <w:tab w:val="center" w:pos="4536"/>
+        <w:tab w:val="right" w:pos="9072"/>
+      </w:tabs>
+    </w:pPr>
+  </w:style>
+  <w:style w:type="character" w:customStyle="1" w:styleId="PieddepageCar">
+    <w:name w:val="Pied de page Car"/>
+    <w:basedOn w:val="Policepardfaut"/>
+    <w:link w:val="Pieddepage"/>
+    <w:uiPriority w:val="99"/>
+    <w:rsid w:val="00696FF0"/>
+  </w:style>
 </w:styles>
 </file>
 

</xml_diff>